<commit_message>
fix(kit-datos): fix heading justification spacing and prevent box splitting across page breaks
</commit_message>
<xml_diff>
--- a/api/assets/kit_datos_files/0_MANUAL_DE_USO_GUIA_RAPIDA_PYMES.docx
+++ b/api/assets/kit_datos_files/0_MANUAL_DE_USO_GUIA_RAPIDA_PYMES.docx
@@ -4,7 +4,8 @@
   <w:body>
     <w:p>
       <w:pPr>
-        <w:spacing w:after="280"/>
+        <w:spacing w:after="200" w:before="0"/>
+        <w:jc w:val="left"/>
       </w:pPr>
       <w:r>
         <w:rPr>
@@ -27,6 +28,7 @@
     </w:p>
     <w:p>
       <w:pPr>
+        <w:keepNext/>
         <w:spacing w:after="80"/>
         <w:jc w:val="center"/>
       </w:pPr>
@@ -35,14 +37,15 @@
           <w:rFonts w:ascii="Calibri" w:hAnsi="Calibri"/>
           <w:b/>
           <w:color w:val="0F172A"/>
-          <w:sz w:val="27"/>
+          <w:sz w:val="26"/>
         </w:rPr>
         <w:t>MANUAL DE USO E IMPLEMENTACIÓN RÁPIDA</w:t>
       </w:r>
     </w:p>
     <w:p>
       <w:pPr>
-        <w:spacing w:after="320"/>
+        <w:keepNext/>
+        <w:spacing w:after="240"/>
         <w:jc w:val="center"/>
       </w:pPr>
       <w:r>
@@ -50,7 +53,7 @@
           <w:rFonts w:ascii="Calibri" w:hAnsi="Calibri"/>
           <w:i/>
           <w:color w:val="475569"/>
-          <w:sz w:val="19"/>
+          <w:sz w:val="18"/>
         </w:rPr>
         <w:t>Kit LegalTech Ley N° 21.719 de Protección de Datos Personales (Chile 2026)</w:t>
         <w:br/>
@@ -65,30 +68,34 @@
         <w:tblLook w:firstColumn="1" w:firstRow="1" w:lastColumn="0" w:lastRow="0" w:noHBand="0" w:noVBand="1" w:val="04A0"/>
       </w:tblPr>
       <w:tblGrid>
-        <w:gridCol w:w="9029"/>
+        <w:gridCol w:w="9317"/>
       </w:tblGrid>
       <w:tr>
+        <w:trPr>
+          <w:cantSplit/>
+        </w:trPr>
         <w:tc>
           <w:tcPr>
-            <w:tcW w:type="dxa" w:w="9029"/>
+            <w:tcW w:type="dxa" w:w="9461"/>
             <w:shd w:fill="F0FDF4"/>
             <w:tcMar>
-              <w:top w:w="140" w:type="dxa"/>
-              <w:bottom w:w="140" w:type="dxa"/>
-              <w:left w:w="180" w:type="dxa"/>
-              <w:right w:w="180" w:type="dxa"/>
+              <w:top w:w="100" w:type="dxa"/>
+              <w:bottom w:w="100" w:type="dxa"/>
+              <w:left w:w="140" w:type="dxa"/>
+              <w:right w:w="140" w:type="dxa"/>
             </w:tcMar>
           </w:tcPr>
           <w:p>
             <w:pPr>
-              <w:spacing w:after="60"/>
+              <w:spacing w:after="40"/>
+              <w:jc w:val="left"/>
             </w:pPr>
             <w:r>
               <w:rPr>
                 <w:rFonts w:ascii="Calibri" w:hAnsi="Calibri"/>
                 <w:b/>
                 <w:color w:val="0284C7"/>
-                <w:sz w:val="20"/>
+                <w:sz w:val="19"/>
               </w:rPr>
               <w:t>PRINCIPIO BÁSICO PARA EL EMPRESARIO PYME (PARA NO ABOGADOS):</w:t>
               <w:br/>
@@ -97,7 +104,7 @@
               <w:rPr>
                 <w:rFonts w:ascii="Calibri" w:hAnsi="Calibri"/>
                 <w:color w:val="334155"/>
-                <w:sz w:val="19"/>
+                <w:sz w:val="18"/>
               </w:rPr>
               <w:t>La Ley N° 21.719 y la Dirección del Trabajo (DT) no exigen que una pyme instale costosos servidores ni gaste $2.000.000 en estudios jurídicos. Lo que la ley exige formalmente es el Principio de Responsabilidad y Diligencia Debida: demostrar por escrito que cuidas los datos de tus dependientes y clientes, que los contratos contienen cláusulas de confidencialidad y que sabes qué hacer si ocurre un incidente.</w:t>
             </w:r>
@@ -107,33 +114,36 @@
     </w:tbl>
     <w:p>
       <w:pPr>
-        <w:spacing w:after="120"/>
+        <w:spacing w:after="80"/>
       </w:pPr>
     </w:p>
     <w:p>
       <w:pPr>
-        <w:spacing w:before="240" w:after="80"/>
+        <w:keepNext/>
+        <w:spacing w:before="200" w:after="60"/>
+        <w:jc w:val="left"/>
       </w:pPr>
       <w:r>
         <w:rPr>
           <w:rFonts w:ascii="Calibri" w:hAnsi="Calibri"/>
           <w:b/>
           <w:color w:val="0284C7"/>
-          <w:sz w:val="22"/>
+          <w:sz w:val="21"/>
         </w:rPr>
         <w:t>1. LA RUTA DE IMPLEMENTACIÓN EN 3 PASOS (15 MINUTOS)</w:t>
       </w:r>
     </w:p>
     <w:p>
       <w:pPr>
-        <w:spacing w:after="120" w:line="276" w:lineRule="auto"/>
+        <w:spacing w:after="100" w:line="276" w:lineRule="auto"/>
+        <w:jc w:val="left"/>
       </w:pPr>
       <w:r>
         <w:rPr>
           <w:rFonts w:ascii="Calibri" w:hAnsi="Calibri"/>
           <w:b/>
           <w:color w:val="0F172A"/>
-          <w:sz w:val="20"/>
+          <w:sz w:val="19"/>
         </w:rPr>
         <w:t xml:space="preserve">PASO 1 (HOY MISMO - ÁREA LABORAL): </w:t>
       </w:r>
@@ -141,21 +151,22 @@
         <w:rPr>
           <w:rFonts w:ascii="Calibri" w:hAnsi="Calibri"/>
           <w:color w:val="1E293B"/>
-          <w:sz w:val="20"/>
+          <w:sz w:val="19"/>
         </w:rPr>
         <w:t>Imprime el Documento 1 (Anexo Laboral). Complétalo con el nombre de tu empresa, RUT y los datos de cada trabajador. Fírmalo junto a la entrega de la liquidación de sueldo y archívalo en la carpeta de personal. Con esto cumples la Resolución Exenta N° 38 de 2024 de la Dirección del Trabajo sobre relojes control y blindas la confidencialidad de licencias médicas.</w:t>
       </w:r>
     </w:p>
     <w:p>
       <w:pPr>
-        <w:spacing w:after="120" w:line="276" w:lineRule="auto"/>
+        <w:spacing w:after="100" w:line="276" w:lineRule="auto"/>
+        <w:jc w:val="left"/>
       </w:pPr>
       <w:r>
         <w:rPr>
           <w:rFonts w:ascii="Calibri" w:hAnsi="Calibri"/>
           <w:b/>
           <w:color w:val="0F172A"/>
-          <w:sz w:val="20"/>
+          <w:sz w:val="19"/>
         </w:rPr>
         <w:t xml:space="preserve">PASO 2 (ESTA SEMANA - ÁREA ADMINISTRATIVA Y WEB): </w:t>
       </w:r>
@@ -163,21 +174,22 @@
         <w:rPr>
           <w:rFonts w:ascii="Calibri" w:hAnsi="Calibri"/>
           <w:color w:val="1E293B"/>
-          <w:sz w:val="20"/>
+          <w:sz w:val="19"/>
         </w:rPr>
         <w:t>Abre el Documento 4 (Excel RAT). En la Fila 3, cambia [NOMBRE DE TU EMPRESA] y [RUT EMPRESA] por tus datos reales y guárdalo en tu computador. Publica el Documento 2 (Política de Privacidad) en el pie de tu sitio web o imprímela para tenerla disponible ante clientes.</w:t>
       </w:r>
     </w:p>
     <w:p>
       <w:pPr>
-        <w:spacing w:after="120" w:line="276" w:lineRule="auto"/>
+        <w:spacing w:after="100" w:line="276" w:lineRule="auto"/>
+        <w:jc w:val="left"/>
       </w:pPr>
       <w:r>
         <w:rPr>
           <w:rFonts w:ascii="Calibri" w:hAnsi="Calibri"/>
           <w:b/>
           <w:color w:val="0F172A"/>
-          <w:sz w:val="20"/>
+          <w:sz w:val="19"/>
         </w:rPr>
         <w:t xml:space="preserve">PASO 3 (DE RESGUARDO - PROTOCOLOS DE EMERGENCIA): </w:t>
       </w:r>
@@ -185,34 +197,66 @@
         <w:rPr>
           <w:rFonts w:ascii="Calibri" w:hAnsi="Calibri"/>
           <w:color w:val="1E293B"/>
-          <w:sz w:val="20"/>
+          <w:sz w:val="19"/>
         </w:rPr>
         <w:t>Archiva los Documentos 3, 5, 6 y 7 en la carpeta digital de administración. Servirán como prueba de cumplimiento si la Dirección del Trabajo o la Agencia de Protección de Datos Personales (APDP) te fiscalizan.</w:t>
       </w:r>
     </w:p>
     <w:p>
+      <w:r>
+        <w:br w:type="page"/>
+      </w:r>
+    </w:p>
+    <w:p>
       <w:pPr>
-        <w:spacing w:before="240" w:after="80"/>
+        <w:spacing w:after="200" w:before="0"/>
+        <w:jc w:val="left"/>
       </w:pPr>
       <w:r>
         <w:rPr>
           <w:rFonts w:ascii="Calibri" w:hAnsi="Calibri"/>
           <w:b/>
           <w:color w:val="0284C7"/>
-          <w:sz w:val="22"/>
+          <w:sz w:val="17"/>
+        </w:rPr>
+        <w:t>CÁLCULO LABORAL CHILE  |  PLATAFORMA LEGALTECH</w:t>
+        <w:br/>
+      </w:r>
+      <w:r>
+        <w:rPr>
+          <w:rFonts w:ascii="Calibri" w:hAnsi="Calibri"/>
+          <w:color w:val="64748B"/>
+          <w:sz w:val="17"/>
+        </w:rPr>
+        <w:t>Kit Ley N° 21.719 de Protección de Datos Personales  •  Documento 0 Oficial  •  Guía Práctica por Sectores y Rubros</w:t>
+      </w:r>
+    </w:p>
+    <w:p>
+      <w:pPr>
+        <w:keepNext/>
+        <w:spacing w:before="200" w:after="60"/>
+        <w:jc w:val="left"/>
+      </w:pPr>
+      <w:r>
+        <w:rPr>
+          <w:rFonts w:ascii="Calibri" w:hAnsi="Calibri"/>
+          <w:b/>
+          <w:color w:val="0284C7"/>
+          <w:sz w:val="21"/>
         </w:rPr>
         <w:t>2. GUÍA POR RUBROS Y SECTORES: ¿ES ESTANDARIZADO O DIFERENTE?</w:t>
       </w:r>
     </w:p>
     <w:p>
       <w:pPr>
-        <w:spacing w:after="120" w:line="276" w:lineRule="auto"/>
+        <w:spacing w:after="100" w:line="276" w:lineRule="auto"/>
+        <w:jc w:val="left"/>
       </w:pPr>
       <w:r>
         <w:rPr>
           <w:rFonts w:ascii="Calibri" w:hAnsi="Calibri"/>
           <w:color w:val="1E293B"/>
-          <w:sz w:val="20"/>
+          <w:sz w:val="19"/>
         </w:rPr>
         <w:t>La ley es IDÉNTICA para todas las empresas de Chile. El 85% del tratamiento de datos (sueldos, boletas, facturas, contratos y licencias médicas) es exactamente el mismo en cualquier rubro. Si perteneces a un sector con particularidades operativas, revisa la siguiente tabla:</w:t>
       </w:r>
@@ -224,29 +268,35 @@
         <w:tblLook w:firstColumn="1" w:firstRow="1" w:lastColumn="0" w:lastRow="0" w:noHBand="0" w:noVBand="1" w:val="04A0"/>
       </w:tblPr>
       <w:tblGrid>
-        <w:gridCol w:w="3010"/>
-        <w:gridCol w:w="3010"/>
-        <w:gridCol w:w="3010"/>
+        <w:gridCol w:w="3154"/>
+        <w:gridCol w:w="3154"/>
+        <w:gridCol w:w="3154"/>
       </w:tblGrid>
       <w:tr>
+        <w:trPr>
+          <w:cantSplit/>
+        </w:trPr>
         <w:tc>
           <w:tcPr>
-            <w:tcW w:type="dxa" w:w="3010"/>
+            <w:tcW w:type="dxa" w:w="3154"/>
             <w:shd w:fill="0F172A"/>
             <w:tcMar>
               <w:top w:w="80" w:type="dxa"/>
               <w:bottom w:w="80" w:type="dxa"/>
-              <w:left w:w="100" w:type="dxa"/>
-              <w:right w:w="100" w:type="dxa"/>
+              <w:left w:w="90" w:type="dxa"/>
+              <w:right w:w="90" w:type="dxa"/>
             </w:tcMar>
           </w:tcPr>
           <w:p>
+            <w:pPr>
+              <w:jc w:val="left"/>
+            </w:pPr>
             <w:r>
               <w:rPr>
                 <w:rFonts w:ascii="Calibri" w:hAnsi="Calibri"/>
                 <w:b/>
                 <w:color w:val="FFFFFF"/>
-                <w:sz w:val="18"/>
+                <w:sz w:val="17"/>
               </w:rPr>
               <w:t>Rubro / Sector</w:t>
             </w:r>
@@ -254,22 +304,25 @@
         </w:tc>
         <w:tc>
           <w:tcPr>
-            <w:tcW w:type="dxa" w:w="3010"/>
+            <w:tcW w:type="dxa" w:w="3154"/>
             <w:shd w:fill="0F172A"/>
             <w:tcMar>
               <w:top w:w="80" w:type="dxa"/>
               <w:bottom w:w="80" w:type="dxa"/>
-              <w:left w:w="100" w:type="dxa"/>
-              <w:right w:w="100" w:type="dxa"/>
+              <w:left w:w="90" w:type="dxa"/>
+              <w:right w:w="90" w:type="dxa"/>
             </w:tcMar>
           </w:tcPr>
           <w:p>
+            <w:pPr>
+              <w:jc w:val="left"/>
+            </w:pPr>
             <w:r>
               <w:rPr>
                 <w:rFonts w:ascii="Calibri" w:hAnsi="Calibri"/>
                 <w:b/>
                 <w:color w:val="FFFFFF"/>
-                <w:sz w:val="18"/>
+                <w:sz w:val="17"/>
               </w:rPr>
               <w:t>¿Qué datos específicos maneja?</w:t>
             </w:r>
@@ -277,22 +330,25 @@
         </w:tc>
         <w:tc>
           <w:tcPr>
-            <w:tcW w:type="dxa" w:w="3010"/>
+            <w:tcW w:type="dxa" w:w="3154"/>
             <w:shd w:fill="0F172A"/>
             <w:tcMar>
               <w:top w:w="80" w:type="dxa"/>
               <w:bottom w:w="80" w:type="dxa"/>
-              <w:left w:w="100" w:type="dxa"/>
-              <w:right w:w="100" w:type="dxa"/>
+              <w:left w:w="90" w:type="dxa"/>
+              <w:right w:w="90" w:type="dxa"/>
             </w:tcMar>
           </w:tcPr>
           <w:p>
+            <w:pPr>
+              <w:jc w:val="left"/>
+            </w:pPr>
             <w:r>
               <w:rPr>
                 <w:rFonts w:ascii="Calibri" w:hAnsi="Calibri"/>
                 <w:b/>
                 <w:color w:val="FFFFFF"/>
-                <w:sz w:val="18"/>
+                <w:sz w:val="17"/>
               </w:rPr>
               <w:t>Instrucción de aplicación con el Kit</w:t>
             </w:r>
@@ -300,18 +356,24 @@
         </w:tc>
       </w:tr>
       <w:tr>
+        <w:trPr>
+          <w:cantSplit/>
+        </w:trPr>
         <w:tc>
           <w:tcPr>
-            <w:tcW w:type="dxa" w:w="3010"/>
+            <w:tcW w:type="dxa" w:w="3154"/>
             <w:shd w:fill="FFFFFF"/>
             <w:tcMar>
-              <w:top w:w="70" w:type="dxa"/>
-              <w:bottom w:w="70" w:type="dxa"/>
-              <w:left w:w="90" w:type="dxa"/>
-              <w:right w:w="90" w:type="dxa"/>
+              <w:top w:w="60" w:type="dxa"/>
+              <w:bottom w:w="60" w:type="dxa"/>
+              <w:left w:w="80" w:type="dxa"/>
+              <w:right w:w="80" w:type="dxa"/>
             </w:tcMar>
           </w:tcPr>
           <w:p>
+            <w:pPr>
+              <w:jc w:val="left"/>
+            </w:pPr>
             <w:r>
               <w:rPr>
                 <w:rFonts w:ascii="Calibri" w:hAnsi="Calibri"/>
@@ -325,16 +387,19 @@
         </w:tc>
         <w:tc>
           <w:tcPr>
-            <w:tcW w:type="dxa" w:w="3010"/>
+            <w:tcW w:type="dxa" w:w="3154"/>
             <w:shd w:fill="FFFFFF"/>
             <w:tcMar>
-              <w:top w:w="70" w:type="dxa"/>
-              <w:bottom w:w="70" w:type="dxa"/>
-              <w:left w:w="90" w:type="dxa"/>
-              <w:right w:w="90" w:type="dxa"/>
+              <w:top w:w="60" w:type="dxa"/>
+              <w:bottom w:w="60" w:type="dxa"/>
+              <w:left w:w="80" w:type="dxa"/>
+              <w:right w:w="80" w:type="dxa"/>
             </w:tcMar>
           </w:tcPr>
           <w:p>
+            <w:pPr>
+              <w:jc w:val="left"/>
+            </w:pPr>
             <w:r>
               <w:rPr>
                 <w:rFonts w:ascii="Calibri" w:hAnsi="Calibri"/>
@@ -347,16 +412,19 @@
         </w:tc>
         <w:tc>
           <w:tcPr>
-            <w:tcW w:type="dxa" w:w="3010"/>
+            <w:tcW w:type="dxa" w:w="3154"/>
             <w:shd w:fill="FFFFFF"/>
             <w:tcMar>
-              <w:top w:w="70" w:type="dxa"/>
-              <w:bottom w:w="70" w:type="dxa"/>
-              <w:left w:w="90" w:type="dxa"/>
-              <w:right w:w="90" w:type="dxa"/>
+              <w:top w:w="60" w:type="dxa"/>
+              <w:bottom w:w="60" w:type="dxa"/>
+              <w:left w:w="80" w:type="dxa"/>
+              <w:right w:w="80" w:type="dxa"/>
             </w:tcMar>
           </w:tcPr>
           <w:p>
+            <w:pPr>
+              <w:jc w:val="left"/>
+            </w:pPr>
             <w:r>
               <w:rPr>
                 <w:rFonts w:ascii="Calibri" w:hAnsi="Calibri"/>
@@ -369,18 +437,24 @@
         </w:tc>
       </w:tr>
       <w:tr>
+        <w:trPr>
+          <w:cantSplit/>
+        </w:trPr>
         <w:tc>
           <w:tcPr>
-            <w:tcW w:type="dxa" w:w="3010"/>
+            <w:tcW w:type="dxa" w:w="3154"/>
             <w:shd w:fill="F8FAFC"/>
             <w:tcMar>
-              <w:top w:w="70" w:type="dxa"/>
-              <w:bottom w:w="70" w:type="dxa"/>
-              <w:left w:w="90" w:type="dxa"/>
-              <w:right w:w="90" w:type="dxa"/>
+              <w:top w:w="60" w:type="dxa"/>
+              <w:bottom w:w="60" w:type="dxa"/>
+              <w:left w:w="80" w:type="dxa"/>
+              <w:right w:w="80" w:type="dxa"/>
             </w:tcMar>
           </w:tcPr>
           <w:p>
+            <w:pPr>
+              <w:jc w:val="left"/>
+            </w:pPr>
             <w:r>
               <w:rPr>
                 <w:rFonts w:ascii="Calibri" w:hAnsi="Calibri"/>
@@ -394,16 +468,19 @@
         </w:tc>
         <w:tc>
           <w:tcPr>
-            <w:tcW w:type="dxa" w:w="3010"/>
+            <w:tcW w:type="dxa" w:w="3154"/>
             <w:shd w:fill="F8FAFC"/>
             <w:tcMar>
-              <w:top w:w="70" w:type="dxa"/>
-              <w:bottom w:w="70" w:type="dxa"/>
-              <w:left w:w="90" w:type="dxa"/>
-              <w:right w:w="90" w:type="dxa"/>
+              <w:top w:w="60" w:type="dxa"/>
+              <w:bottom w:w="60" w:type="dxa"/>
+              <w:left w:w="80" w:type="dxa"/>
+              <w:right w:w="80" w:type="dxa"/>
             </w:tcMar>
           </w:tcPr>
           <w:p>
+            <w:pPr>
+              <w:jc w:val="left"/>
+            </w:pPr>
             <w:r>
               <w:rPr>
                 <w:rFonts w:ascii="Calibri" w:hAnsi="Calibri"/>
@@ -416,16 +493,19 @@
         </w:tc>
         <w:tc>
           <w:tcPr>
-            <w:tcW w:type="dxa" w:w="3010"/>
+            <w:tcW w:type="dxa" w:w="3154"/>
             <w:shd w:fill="F8FAFC"/>
             <w:tcMar>
-              <w:top w:w="70" w:type="dxa"/>
-              <w:bottom w:w="70" w:type="dxa"/>
-              <w:left w:w="90" w:type="dxa"/>
-              <w:right w:w="90" w:type="dxa"/>
+              <w:top w:w="60" w:type="dxa"/>
+              <w:bottom w:w="60" w:type="dxa"/>
+              <w:left w:w="80" w:type="dxa"/>
+              <w:right w:w="80" w:type="dxa"/>
             </w:tcMar>
           </w:tcPr>
           <w:p>
+            <w:pPr>
+              <w:jc w:val="left"/>
+            </w:pPr>
             <w:r>
               <w:rPr>
                 <w:rFonts w:ascii="Calibri" w:hAnsi="Calibri"/>
@@ -438,18 +518,24 @@
         </w:tc>
       </w:tr>
       <w:tr>
+        <w:trPr>
+          <w:cantSplit/>
+        </w:trPr>
         <w:tc>
           <w:tcPr>
-            <w:tcW w:type="dxa" w:w="3010"/>
+            <w:tcW w:type="dxa" w:w="3154"/>
             <w:shd w:fill="FFFFFF"/>
             <w:tcMar>
-              <w:top w:w="70" w:type="dxa"/>
-              <w:bottom w:w="70" w:type="dxa"/>
-              <w:left w:w="90" w:type="dxa"/>
-              <w:right w:w="90" w:type="dxa"/>
+              <w:top w:w="60" w:type="dxa"/>
+              <w:bottom w:w="60" w:type="dxa"/>
+              <w:left w:w="80" w:type="dxa"/>
+              <w:right w:w="80" w:type="dxa"/>
             </w:tcMar>
           </w:tcPr>
           <w:p>
+            <w:pPr>
+              <w:jc w:val="left"/>
+            </w:pPr>
             <w:r>
               <w:rPr>
                 <w:rFonts w:ascii="Calibri" w:hAnsi="Calibri"/>
@@ -463,16 +549,19 @@
         </w:tc>
         <w:tc>
           <w:tcPr>
-            <w:tcW w:type="dxa" w:w="3010"/>
+            <w:tcW w:type="dxa" w:w="3154"/>
             <w:shd w:fill="FFFFFF"/>
             <w:tcMar>
-              <w:top w:w="70" w:type="dxa"/>
-              <w:bottom w:w="70" w:type="dxa"/>
-              <w:left w:w="90" w:type="dxa"/>
-              <w:right w:w="90" w:type="dxa"/>
+              <w:top w:w="60" w:type="dxa"/>
+              <w:bottom w:w="60" w:type="dxa"/>
+              <w:left w:w="80" w:type="dxa"/>
+              <w:right w:w="80" w:type="dxa"/>
             </w:tcMar>
           </w:tcPr>
           <w:p>
+            <w:pPr>
+              <w:jc w:val="left"/>
+            </w:pPr>
             <w:r>
               <w:rPr>
                 <w:rFonts w:ascii="Calibri" w:hAnsi="Calibri"/>
@@ -485,16 +574,19 @@
         </w:tc>
         <w:tc>
           <w:tcPr>
-            <w:tcW w:type="dxa" w:w="3010"/>
+            <w:tcW w:type="dxa" w:w="3154"/>
             <w:shd w:fill="FFFFFF"/>
             <w:tcMar>
-              <w:top w:w="70" w:type="dxa"/>
-              <w:bottom w:w="70" w:type="dxa"/>
-              <w:left w:w="90" w:type="dxa"/>
-              <w:right w:w="90" w:type="dxa"/>
+              <w:top w:w="60" w:type="dxa"/>
+              <w:bottom w:w="60" w:type="dxa"/>
+              <w:left w:w="80" w:type="dxa"/>
+              <w:right w:w="80" w:type="dxa"/>
             </w:tcMar>
           </w:tcPr>
           <w:p>
+            <w:pPr>
+              <w:jc w:val="left"/>
+            </w:pPr>
             <w:r>
               <w:rPr>
                 <w:rFonts w:ascii="Calibri" w:hAnsi="Calibri"/>
@@ -507,18 +599,24 @@
         </w:tc>
       </w:tr>
       <w:tr>
+        <w:trPr>
+          <w:cantSplit/>
+        </w:trPr>
         <w:tc>
           <w:tcPr>
-            <w:tcW w:type="dxa" w:w="3010"/>
+            <w:tcW w:type="dxa" w:w="3154"/>
             <w:shd w:fill="F8FAFC"/>
             <w:tcMar>
-              <w:top w:w="70" w:type="dxa"/>
-              <w:bottom w:w="70" w:type="dxa"/>
-              <w:left w:w="90" w:type="dxa"/>
-              <w:right w:w="90" w:type="dxa"/>
+              <w:top w:w="60" w:type="dxa"/>
+              <w:bottom w:w="60" w:type="dxa"/>
+              <w:left w:w="80" w:type="dxa"/>
+              <w:right w:w="80" w:type="dxa"/>
             </w:tcMar>
           </w:tcPr>
           <w:p>
+            <w:pPr>
+              <w:jc w:val="left"/>
+            </w:pPr>
             <w:r>
               <w:rPr>
                 <w:rFonts w:ascii="Calibri" w:hAnsi="Calibri"/>
@@ -532,16 +630,19 @@
         </w:tc>
         <w:tc>
           <w:tcPr>
-            <w:tcW w:type="dxa" w:w="3010"/>
+            <w:tcW w:type="dxa" w:w="3154"/>
             <w:shd w:fill="F8FAFC"/>
             <w:tcMar>
-              <w:top w:w="70" w:type="dxa"/>
-              <w:bottom w:w="70" w:type="dxa"/>
-              <w:left w:w="90" w:type="dxa"/>
-              <w:right w:w="90" w:type="dxa"/>
+              <w:top w:w="60" w:type="dxa"/>
+              <w:bottom w:w="60" w:type="dxa"/>
+              <w:left w:w="80" w:type="dxa"/>
+              <w:right w:w="80" w:type="dxa"/>
             </w:tcMar>
           </w:tcPr>
           <w:p>
+            <w:pPr>
+              <w:jc w:val="left"/>
+            </w:pPr>
             <w:r>
               <w:rPr>
                 <w:rFonts w:ascii="Calibri" w:hAnsi="Calibri"/>
@@ -554,16 +655,19 @@
         </w:tc>
         <w:tc>
           <w:tcPr>
-            <w:tcW w:type="dxa" w:w="3010"/>
+            <w:tcW w:type="dxa" w:w="3154"/>
             <w:shd w:fill="F8FAFC"/>
             <w:tcMar>
-              <w:top w:w="70" w:type="dxa"/>
-              <w:bottom w:w="70" w:type="dxa"/>
-              <w:left w:w="90" w:type="dxa"/>
-              <w:right w:w="90" w:type="dxa"/>
+              <w:top w:w="60" w:type="dxa"/>
+              <w:bottom w:w="60" w:type="dxa"/>
+              <w:left w:w="80" w:type="dxa"/>
+              <w:right w:w="80" w:type="dxa"/>
             </w:tcMar>
           </w:tcPr>
           <w:p>
+            <w:pPr>
+              <w:jc w:val="left"/>
+            </w:pPr>
             <w:r>
               <w:rPr>
                 <w:rFonts w:ascii="Calibri" w:hAnsi="Calibri"/>
@@ -576,18 +680,24 @@
         </w:tc>
       </w:tr>
       <w:tr>
+        <w:trPr>
+          <w:cantSplit/>
+        </w:trPr>
         <w:tc>
           <w:tcPr>
-            <w:tcW w:type="dxa" w:w="3010"/>
+            <w:tcW w:type="dxa" w:w="3154"/>
             <w:shd w:fill="FFFFFF"/>
             <w:tcMar>
-              <w:top w:w="70" w:type="dxa"/>
-              <w:bottom w:w="70" w:type="dxa"/>
-              <w:left w:w="90" w:type="dxa"/>
-              <w:right w:w="90" w:type="dxa"/>
+              <w:top w:w="60" w:type="dxa"/>
+              <w:bottom w:w="60" w:type="dxa"/>
+              <w:left w:w="80" w:type="dxa"/>
+              <w:right w:w="80" w:type="dxa"/>
             </w:tcMar>
           </w:tcPr>
           <w:p>
+            <w:pPr>
+              <w:jc w:val="left"/>
+            </w:pPr>
             <w:r>
               <w:rPr>
                 <w:rFonts w:ascii="Calibri" w:hAnsi="Calibri"/>
@@ -601,16 +711,19 @@
         </w:tc>
         <w:tc>
           <w:tcPr>
-            <w:tcW w:type="dxa" w:w="3010"/>
+            <w:tcW w:type="dxa" w:w="3154"/>
             <w:shd w:fill="FFFFFF"/>
             <w:tcMar>
-              <w:top w:w="70" w:type="dxa"/>
-              <w:bottom w:w="70" w:type="dxa"/>
-              <w:left w:w="90" w:type="dxa"/>
-              <w:right w:w="90" w:type="dxa"/>
+              <w:top w:w="60" w:type="dxa"/>
+              <w:bottom w:w="60" w:type="dxa"/>
+              <w:left w:w="80" w:type="dxa"/>
+              <w:right w:w="80" w:type="dxa"/>
             </w:tcMar>
           </w:tcPr>
           <w:p>
+            <w:pPr>
+              <w:jc w:val="left"/>
+            </w:pPr>
             <w:r>
               <w:rPr>
                 <w:rFonts w:ascii="Calibri" w:hAnsi="Calibri"/>
@@ -623,16 +736,19 @@
         </w:tc>
         <w:tc>
           <w:tcPr>
-            <w:tcW w:type="dxa" w:w="3010"/>
+            <w:tcW w:type="dxa" w:w="3154"/>
             <w:shd w:fill="FFFFFF"/>
             <w:tcMar>
-              <w:top w:w="70" w:type="dxa"/>
-              <w:bottom w:w="70" w:type="dxa"/>
-              <w:left w:w="90" w:type="dxa"/>
-              <w:right w:w="90" w:type="dxa"/>
+              <w:top w:w="60" w:type="dxa"/>
+              <w:bottom w:w="60" w:type="dxa"/>
+              <w:left w:w="80" w:type="dxa"/>
+              <w:right w:w="80" w:type="dxa"/>
             </w:tcMar>
           </w:tcPr>
           <w:p>
+            <w:pPr>
+              <w:jc w:val="left"/>
+            </w:pPr>
             <w:r>
               <w:rPr>
                 <w:rFonts w:ascii="Calibri" w:hAnsi="Calibri"/>
@@ -645,18 +761,24 @@
         </w:tc>
       </w:tr>
       <w:tr>
+        <w:trPr>
+          <w:cantSplit/>
+        </w:trPr>
         <w:tc>
           <w:tcPr>
-            <w:tcW w:type="dxa" w:w="3010"/>
+            <w:tcW w:type="dxa" w:w="3154"/>
             <w:shd w:fill="F8FAFC"/>
             <w:tcMar>
-              <w:top w:w="70" w:type="dxa"/>
-              <w:bottom w:w="70" w:type="dxa"/>
-              <w:left w:w="90" w:type="dxa"/>
-              <w:right w:w="90" w:type="dxa"/>
+              <w:top w:w="60" w:type="dxa"/>
+              <w:bottom w:w="60" w:type="dxa"/>
+              <w:left w:w="80" w:type="dxa"/>
+              <w:right w:w="80" w:type="dxa"/>
             </w:tcMar>
           </w:tcPr>
           <w:p>
+            <w:pPr>
+              <w:jc w:val="left"/>
+            </w:pPr>
             <w:r>
               <w:rPr>
                 <w:rFonts w:ascii="Calibri" w:hAnsi="Calibri"/>
@@ -670,16 +792,19 @@
         </w:tc>
         <w:tc>
           <w:tcPr>
-            <w:tcW w:type="dxa" w:w="3010"/>
+            <w:tcW w:type="dxa" w:w="3154"/>
             <w:shd w:fill="F8FAFC"/>
             <w:tcMar>
-              <w:top w:w="70" w:type="dxa"/>
-              <w:bottom w:w="70" w:type="dxa"/>
-              <w:left w:w="90" w:type="dxa"/>
-              <w:right w:w="90" w:type="dxa"/>
+              <w:top w:w="60" w:type="dxa"/>
+              <w:bottom w:w="60" w:type="dxa"/>
+              <w:left w:w="80" w:type="dxa"/>
+              <w:right w:w="80" w:type="dxa"/>
             </w:tcMar>
           </w:tcPr>
           <w:p>
+            <w:pPr>
+              <w:jc w:val="left"/>
+            </w:pPr>
             <w:r>
               <w:rPr>
                 <w:rFonts w:ascii="Calibri" w:hAnsi="Calibri"/>
@@ -692,16 +817,19 @@
         </w:tc>
         <w:tc>
           <w:tcPr>
-            <w:tcW w:type="dxa" w:w="3010"/>
+            <w:tcW w:type="dxa" w:w="3154"/>
             <w:shd w:fill="F8FAFC"/>
             <w:tcMar>
-              <w:top w:w="70" w:type="dxa"/>
-              <w:bottom w:w="70" w:type="dxa"/>
-              <w:left w:w="90" w:type="dxa"/>
-              <w:right w:w="90" w:type="dxa"/>
+              <w:top w:w="60" w:type="dxa"/>
+              <w:bottom w:w="60" w:type="dxa"/>
+              <w:left w:w="80" w:type="dxa"/>
+              <w:right w:w="80" w:type="dxa"/>
             </w:tcMar>
           </w:tcPr>
           <w:p>
+            <w:pPr>
+              <w:jc w:val="left"/>
+            </w:pPr>
             <w:r>
               <w:rPr>
                 <w:rFonts w:ascii="Calibri" w:hAnsi="Calibri"/>
@@ -715,29 +843,61 @@
       </w:tr>
     </w:tbl>
     <w:p>
+      <w:r>
+        <w:br w:type="page"/>
+      </w:r>
+    </w:p>
+    <w:p>
       <w:pPr>
-        <w:spacing w:before="240" w:after="80"/>
+        <w:spacing w:after="200" w:before="0"/>
+        <w:jc w:val="left"/>
       </w:pPr>
       <w:r>
         <w:rPr>
           <w:rFonts w:ascii="Calibri" w:hAnsi="Calibri"/>
           <w:b/>
           <w:color w:val="0284C7"/>
-          <w:sz w:val="22"/>
+          <w:sz w:val="17"/>
+        </w:rPr>
+        <w:t>CÁLCULO LABORAL CHILE  |  PLATAFORMA LEGALTECH</w:t>
+        <w:br/>
+      </w:r>
+      <w:r>
+        <w:rPr>
+          <w:rFonts w:ascii="Calibri" w:hAnsi="Calibri"/>
+          <w:color w:val="64748B"/>
+          <w:sz w:val="17"/>
+        </w:rPr>
+        <w:t>Kit Ley N° 21.719 de Protección de Datos Personales  •  Documento 0 Oficial  •  Preguntas Frecuentes y Checklist de Blindaje</w:t>
+      </w:r>
+    </w:p>
+    <w:p>
+      <w:pPr>
+        <w:keepNext/>
+        <w:spacing w:before="200" w:after="60"/>
+        <w:jc w:val="left"/>
+      </w:pPr>
+      <w:r>
+        <w:rPr>
+          <w:rFonts w:ascii="Calibri" w:hAnsi="Calibri"/>
+          <w:b/>
+          <w:color w:val="0284C7"/>
+          <w:sz w:val="21"/>
         </w:rPr>
         <w:t>3. PREGUNTAS FRECUENTES (FAQ) DE DUEÑOS Y GERENTES DE PYMES</w:t>
       </w:r>
     </w:p>
     <w:p>
       <w:pPr>
-        <w:spacing w:after="120" w:line="276" w:lineRule="auto"/>
+        <w:spacing w:after="100" w:line="276" w:lineRule="auto"/>
+        <w:jc w:val="left"/>
       </w:pPr>
       <w:r>
         <w:rPr>
           <w:rFonts w:ascii="Calibri" w:hAnsi="Calibri"/>
           <w:b/>
           <w:color w:val="0F172A"/>
-          <w:sz w:val="20"/>
+          <w:sz w:val="19"/>
         </w:rPr>
         <w:t xml:space="preserve">¿Tengo que enviar estos documentos a alguna entidad del Estado? </w:t>
       </w:r>
@@ -745,21 +905,22 @@
         <w:rPr>
           <w:rFonts w:ascii="Calibri" w:hAnsi="Calibri"/>
           <w:color w:val="1E293B"/>
-          <w:sz w:val="20"/>
+          <w:sz w:val="19"/>
         </w:rPr>
         <w:t>No. Ninguna ley exige enviar copias al Estado. Se custodian internamente en la empresa y se exhiben únicamente cuando la Dirección del Trabajo o la Agencia APDP fiscalizan.</w:t>
       </w:r>
     </w:p>
     <w:p>
       <w:pPr>
-        <w:spacing w:after="120" w:line="276" w:lineRule="auto"/>
+        <w:spacing w:after="100" w:line="276" w:lineRule="auto"/>
+        <w:jc w:val="left"/>
       </w:pPr>
       <w:r>
         <w:rPr>
           <w:rFonts w:ascii="Calibri" w:hAnsi="Calibri"/>
           <w:b/>
           <w:color w:val="0F172A"/>
-          <w:sz w:val="20"/>
+          <w:sz w:val="19"/>
         </w:rPr>
         <w:t xml:space="preserve">¿Qué pasa si un trabajador se niega a poner la huella en el reloj control? </w:t>
       </w:r>
@@ -767,21 +928,22 @@
         <w:rPr>
           <w:rFonts w:ascii="Calibri" w:hAnsi="Calibri"/>
           <w:color w:val="1E293B"/>
-          <w:sz w:val="20"/>
+          <w:sz w:val="19"/>
         </w:rPr>
         <w:t>La Dirección del Trabajo (Res. Ex. N° 38/2024) prohíbe despedirlo o sancionarlo. Debes ofrecerle una alternativa no biométrica (tarjeta magnética, clave o libro). Al tener firmado nuestro Documento 1, tu empresa queda blindada.</w:t>
       </w:r>
     </w:p>
     <w:p>
       <w:pPr>
-        <w:spacing w:after="120" w:line="276" w:lineRule="auto"/>
+        <w:spacing w:after="100" w:line="276" w:lineRule="auto"/>
+        <w:jc w:val="left"/>
       </w:pPr>
       <w:r>
         <w:rPr>
           <w:rFonts w:ascii="Calibri" w:hAnsi="Calibri"/>
           <w:b/>
           <w:color w:val="0F172A"/>
-          <w:sz w:val="20"/>
+          <w:sz w:val="19"/>
         </w:rPr>
         <w:t xml:space="preserve">¿Qué hacer ante un hackeo o robo de computador con datos? </w:t>
       </w:r>
@@ -789,21 +951,22 @@
         <w:rPr>
           <w:rFonts w:ascii="Calibri" w:hAnsi="Calibri"/>
           <w:color w:val="1E293B"/>
-          <w:sz w:val="20"/>
+          <w:sz w:val="19"/>
         </w:rPr>
         <w:t>Abre inmediatamente el Documento 5 (Protocolo de Brechas). Sigue los 4 pasos: aislar el equipo, evaluar qué datos se vieron afectados y remitir el reporte a la Agencia sin dilaciones indebidas (meta 72 horas).</w:t>
       </w:r>
     </w:p>
     <w:p>
       <w:pPr>
-        <w:spacing w:after="120" w:line="276" w:lineRule="auto"/>
+        <w:spacing w:after="100" w:line="276" w:lineRule="auto"/>
+        <w:jc w:val="left"/>
       </w:pPr>
       <w:r>
         <w:rPr>
           <w:rFonts w:ascii="Calibri" w:hAnsi="Calibri"/>
           <w:b/>
           <w:color w:val="0F172A"/>
-          <w:sz w:val="20"/>
+          <w:sz w:val="19"/>
         </w:rPr>
         <w:t xml:space="preserve">¿Debo contratar a un Delegado de Protección de Datos (DPO)? </w:t>
       </w:r>
@@ -811,21 +974,23 @@
         <w:rPr>
           <w:rFonts w:ascii="Calibri" w:hAnsi="Calibri"/>
           <w:color w:val="1E293B"/>
-          <w:sz w:val="20"/>
+          <w:sz w:val="19"/>
         </w:rPr>
         <w:t>No. Las micro, pequeñas y medianas empresas están legalmente exentas. Para acreditarlo formalmente ante cualquier inspector, firma el Documento 7 (Test DPO) incluido en este kit.</w:t>
       </w:r>
     </w:p>
     <w:p>
       <w:pPr>
-        <w:spacing w:before="240" w:after="80"/>
+        <w:keepNext/>
+        <w:spacing w:before="200" w:after="60"/>
+        <w:jc w:val="left"/>
       </w:pPr>
       <w:r>
         <w:rPr>
           <w:rFonts w:ascii="Calibri" w:hAnsi="Calibri"/>
           <w:b/>
           <w:color w:val="0284C7"/>
-          <w:sz w:val="22"/>
+          <w:sz w:val="21"/>
         </w:rPr>
         <w:t>4. CHECKLIST DE BLINDAJE TOTAL (LISTA DE COTEJO)</w:t>
       </w:r>
@@ -833,14 +998,15 @@
     <w:p>
       <w:pPr>
         <w:pStyle w:val="ListBullet"/>
-        <w:spacing w:after="80" w:line="276" w:lineRule="auto"/>
+        <w:spacing w:after="60" w:line="276" w:lineRule="auto"/>
+        <w:jc w:val="left"/>
       </w:pPr>
       <w:r>
         <w:rPr>
           <w:rFonts w:ascii="Calibri" w:hAnsi="Calibri"/>
           <w:b/>
           <w:color w:val="0F172A"/>
-          <w:sz w:val="20"/>
+          <w:sz w:val="19"/>
         </w:rPr>
         <w:t xml:space="preserve">[  ] Documento 1 (Anexo Laboral): </w:t>
       </w:r>
@@ -848,7 +1014,7 @@
         <w:rPr>
           <w:rFonts w:ascii="Calibri" w:hAnsi="Calibri"/>
           <w:color w:val="1E293B"/>
-          <w:sz w:val="20"/>
+          <w:sz w:val="19"/>
         </w:rPr>
         <w:t>Todos los trabajadores contratados tienen firmado el anexo de datos personales y huella archivado en su carpeta de personal.</w:t>
       </w:r>
@@ -856,14 +1022,15 @@
     <w:p>
       <w:pPr>
         <w:pStyle w:val="ListBullet"/>
-        <w:spacing w:after="80" w:line="276" w:lineRule="auto"/>
+        <w:spacing w:after="60" w:line="276" w:lineRule="auto"/>
+        <w:jc w:val="left"/>
       </w:pPr>
       <w:r>
         <w:rPr>
           <w:rFonts w:ascii="Calibri" w:hAnsi="Calibri"/>
           <w:b/>
           <w:color w:val="0F172A"/>
-          <w:sz w:val="20"/>
+          <w:sz w:val="19"/>
         </w:rPr>
         <w:t xml:space="preserve">[  ] Documento 2 (Política de Privacidad): </w:t>
       </w:r>
@@ -871,7 +1038,7 @@
         <w:rPr>
           <w:rFonts w:ascii="Calibri" w:hAnsi="Calibri"/>
           <w:color w:val="1E293B"/>
-          <w:sz w:val="20"/>
+          <w:sz w:val="19"/>
         </w:rPr>
         <w:t>Texto visible en el pie de página de la web o anexado a correos de cotizaciones y disponible en recepción.</w:t>
       </w:r>
@@ -879,14 +1046,15 @@
     <w:p>
       <w:pPr>
         <w:pStyle w:val="ListBullet"/>
-        <w:spacing w:after="80" w:line="276" w:lineRule="auto"/>
+        <w:spacing w:after="60" w:line="276" w:lineRule="auto"/>
+        <w:jc w:val="left"/>
       </w:pPr>
       <w:r>
         <w:rPr>
           <w:rFonts w:ascii="Calibri" w:hAnsi="Calibri"/>
           <w:b/>
           <w:color w:val="0F172A"/>
-          <w:sz w:val="20"/>
+          <w:sz w:val="19"/>
         </w:rPr>
         <w:t xml:space="preserve">[  ] Documento 3 (Cláusula DPA): </w:t>
       </w:r>
@@ -894,7 +1062,7 @@
         <w:rPr>
           <w:rFonts w:ascii="Calibri" w:hAnsi="Calibri"/>
           <w:color w:val="1E293B"/>
-          <w:sz w:val="20"/>
+          <w:sz w:val="19"/>
         </w:rPr>
         <w:t>Suscrito con el contador externo de la empresa y con los proveedores de software o hosting.</w:t>
       </w:r>
@@ -902,14 +1070,15 @@
     <w:p>
       <w:pPr>
         <w:pStyle w:val="ListBullet"/>
-        <w:spacing w:after="80" w:line="276" w:lineRule="auto"/>
+        <w:spacing w:after="60" w:line="276" w:lineRule="auto"/>
+        <w:jc w:val="left"/>
       </w:pPr>
       <w:r>
         <w:rPr>
           <w:rFonts w:ascii="Calibri" w:hAnsi="Calibri"/>
           <w:b/>
           <w:color w:val="0F172A"/>
-          <w:sz w:val="20"/>
+          <w:sz w:val="19"/>
         </w:rPr>
         <w:t xml:space="preserve">[  ] Documento 4 (Registro RAT): </w:t>
       </w:r>
@@ -917,7 +1086,7 @@
         <w:rPr>
           <w:rFonts w:ascii="Calibri" w:hAnsi="Calibri"/>
           <w:color w:val="1E293B"/>
-          <w:sz w:val="20"/>
+          <w:sz w:val="19"/>
         </w:rPr>
         <w:t>Planilla completada con el Nombre y RUT en la Fila 3, archivada en formato Excel y PDF en el computador de administración.</w:t>
       </w:r>
@@ -925,14 +1094,15 @@
     <w:p>
       <w:pPr>
         <w:pStyle w:val="ListBullet"/>
-        <w:spacing w:after="80" w:line="276" w:lineRule="auto"/>
+        <w:spacing w:after="60" w:line="276" w:lineRule="auto"/>
+        <w:jc w:val="left"/>
       </w:pPr>
       <w:r>
         <w:rPr>
           <w:rFonts w:ascii="Calibri" w:hAnsi="Calibri"/>
           <w:b/>
           <w:color w:val="0F172A"/>
-          <w:sz w:val="20"/>
+          <w:sz w:val="19"/>
         </w:rPr>
         <w:t xml:space="preserve">[  ] Documento 5 (Protocolo de Brechas 72h): </w:t>
       </w:r>
@@ -940,7 +1110,7 @@
         <w:rPr>
           <w:rFonts w:ascii="Calibri" w:hAnsi="Calibri"/>
           <w:color w:val="1E293B"/>
-          <w:sz w:val="20"/>
+          <w:sz w:val="19"/>
         </w:rPr>
         <w:t>Procedimiento conocido por administración ante cualquier sospecha de hackeo, pérdida de laptop o filtración.</w:t>
       </w:r>
@@ -948,14 +1118,15 @@
     <w:p>
       <w:pPr>
         <w:pStyle w:val="ListBullet"/>
-        <w:spacing w:after="80" w:line="276" w:lineRule="auto"/>
+        <w:spacing w:after="60" w:line="276" w:lineRule="auto"/>
+        <w:jc w:val="left"/>
       </w:pPr>
       <w:r>
         <w:rPr>
           <w:rFonts w:ascii="Calibri" w:hAnsi="Calibri"/>
           <w:b/>
           <w:color w:val="0F172A"/>
-          <w:sz w:val="20"/>
+          <w:sz w:val="19"/>
         </w:rPr>
         <w:t xml:space="preserve">[  ] Documento 6 (Formulario ARCOP): </w:t>
       </w:r>
@@ -963,7 +1134,7 @@
         <w:rPr>
           <w:rFonts w:ascii="Calibri" w:hAnsi="Calibri"/>
           <w:color w:val="1E293B"/>
-          <w:sz w:val="20"/>
+          <w:sz w:val="19"/>
         </w:rPr>
         <w:t>Plantilla lista para responder reclamos de clientes o trabajadores en el plazo legal fatal de 30 días corridos.</w:t>
       </w:r>
@@ -971,14 +1142,15 @@
     <w:p>
       <w:pPr>
         <w:pStyle w:val="ListBullet"/>
-        <w:spacing w:after="80" w:line="276" w:lineRule="auto"/>
+        <w:spacing w:after="60" w:line="276" w:lineRule="auto"/>
+        <w:jc w:val="left"/>
       </w:pPr>
       <w:r>
         <w:rPr>
           <w:rFonts w:ascii="Calibri" w:hAnsi="Calibri"/>
           <w:b/>
           <w:color w:val="0F172A"/>
-          <w:sz w:val="20"/>
+          <w:sz w:val="19"/>
         </w:rPr>
         <w:t xml:space="preserve">[  ] Documento 7 (Test DPO): </w:t>
       </w:r>
@@ -986,14 +1158,14 @@
         <w:rPr>
           <w:rFonts w:ascii="Calibri" w:hAnsi="Calibri"/>
           <w:color w:val="1E293B"/>
-          <w:sz w:val="20"/>
+          <w:sz w:val="19"/>
         </w:rPr>
         <w:t>Test de 4 preguntas firmado por el representante legal que acredita la exención formal de contratar un DPO.</w:t>
       </w:r>
     </w:p>
     <w:sectPr>
       <w:pgSz w:w="11909" w:h="16834"/>
-      <w:pgMar w:top="1296" w:right="1440" w:bottom="1296" w:left="1440" w:header="720" w:footer="720" w:gutter="0"/>
+      <w:pgMar w:top="1152" w:right="1224" w:bottom="1152" w:left="1224" w:header="720" w:footer="720" w:gutter="0"/>
       <w:cols w:space="720"/>
       <w:docGrid w:linePitch="360"/>
     </w:sectPr>

</xml_diff>

<commit_message>
fix(legal): depurar afirmaciones no demostrables en todos los productos de pago y documentos gratuitos
</commit_message>
<xml_diff>
--- a/api/assets/kit_datos_files/0_MANUAL_DE_USO_GUIA_RAPIDA_PYMES.docx
+++ b/api/assets/kit_datos_files/0_MANUAL_DE_USO_GUIA_RAPIDA_PYMES.docx
@@ -23,7 +23,7 @@
           <w:color w:val="64748B"/>
           <w:sz w:val="17"/>
         </w:rPr>
-        <w:t>Kit Ley N° 21.719 de Protección de Datos Personales  •  Documento 0 Oficial  •  Guía Maestra de Implementación</w:t>
+        <w:t>Kit Ley N° 21.719 de Protección de Datos Personales  •  Documento 0  •  Guía Maestra de Implementación</w:t>
       </w:r>
     </w:p>
     <w:p>
@@ -228,7 +228,7 @@
           <w:color w:val="64748B"/>
           <w:sz w:val="17"/>
         </w:rPr>
-        <w:t>Kit Ley N° 21.719 de Protección de Datos Personales  •  Documento 0 Oficial  •  Guía Práctica por Sectores y Rubros</w:t>
+        <w:t>Kit Ley N° 21.719 de Protección de Datos Personales  •  Documento 0  •  Guía Práctica por Sectores y Rubros</w:t>
       </w:r>
     </w:p>
     <w:p>
@@ -868,7 +868,7 @@
           <w:color w:val="64748B"/>
           <w:sz w:val="17"/>
         </w:rPr>
-        <w:t>Kit Ley N° 21.719 de Protección de Datos Personales  •  Documento 0 Oficial  •  Preguntas Frecuentes y Checklist de Blindaje</w:t>
+        <w:t>Kit Ley N° 21.719 de Protección de Datos Personales  •  Documento 0  •  Preguntas Frecuentes y Checklist Preventivo</w:t>
       </w:r>
     </w:p>
     <w:p>
@@ -930,7 +930,7 @@
           <w:color w:val="1E293B"/>
           <w:sz w:val="19"/>
         </w:rPr>
-        <w:t>La Dirección del Trabajo (Res. Ex. N° 38/2024) prohíbe despedirlo o sancionarlo. Debes ofrecerle una alternativa no biométrica (tarjeta magnética, clave o libro). Al tener firmado nuestro Documento 1, tu empresa queda blindada.</w:t>
+        <w:t>La Dirección del Trabajo (Res. Ex. N° 38/2024) prohíbe despedirlo o sancionarlo. Debes ofrecerle una alternativa no biométrica (tarjeta magnética, clave o libro). Al tener firmado nuestro Documento 1, tu empresa adopta el estándar preventivo exigido por la DT para prevenir sanciones.</w:t>
       </w:r>
     </w:p>
     <w:p>
@@ -992,7 +992,7 @@
           <w:color w:val="0284C7"/>
           <w:sz w:val="21"/>
         </w:rPr>
-        <w:t>4. CHECKLIST DE BLINDAJE TOTAL (LISTA DE COTEJO)</w:t>
+        <w:t>4. CHECKLIST DE CUMPLIMIENTO NORMATIVO (LISTA DE COTEJO)</w:t>
       </w:r>
     </w:p>
     <w:p>

</xml_diff>

<commit_message>
feat(kits): documentos Word y manuales PDF con la identidad nueva
- Kit Ley 21.719: el generador usa verde bosque, recuadros menta y firmas en Calibri.
- Kit Blindaje: recoloreado por post-proceso del XML (sin fuente docx), filete
  verde bajo el titulo, celda de titulo a ancho completo y orden OOXML corregido.
- Manuales: logo oficial con isotipo, Geist, sin emojis ni encabezado del
  navegador, numeracion unica y ".docx" en lugar de ".doc".
- Paquetes base64 de envio por correo regenerados.

Co-Authored-By: Claude Opus 5.5 <noreply@anthropic.com>
</commit_message>
<xml_diff>
--- a/api/assets/kit_datos_files/0_MANUAL_DE_USO_GUIA_RAPIDA_PYMES.docx
+++ b/api/assets/kit_datos_files/0_MANUAL_DE_USO_GUIA_RAPIDA_PYMES.docx
@@ -11,10 +11,10 @@
         <w:rPr>
           <w:rFonts w:ascii="Calibri" w:hAnsi="Calibri"/>
           <w:b/>
-          <w:color w:val="0284C7"/>
+          <w:color w:val="00382E"/>
           <w:sz w:val="17"/>
         </w:rPr>
-        <w:t>CÁLCULO LABORAL CHILE  |  PLATAFORMA LEGALTECH</w:t>
+        <w:t>CálculoLaboral.cl</w:t>
         <w:br/>
       </w:r>
       <w:r>
@@ -76,8 +76,8 @@
         </w:trPr>
         <w:tc>
           <w:tcPr>
-            <w:tcW w:type="dxa" w:w="9461"/>
-            <w:shd w:fill="F0FDF4"/>
+            <w:tcW w:type="dxa" w:w="9317"/>
+            <w:shd w:fill="EEF6F3"/>
             <w:tcMar>
               <w:top w:w="100" w:type="dxa"/>
               <w:bottom w:w="100" w:type="dxa"/>
@@ -94,7 +94,7 @@
               <w:rPr>
                 <w:rFonts w:ascii="Calibri" w:hAnsi="Calibri"/>
                 <w:b/>
-                <w:color w:val="0284C7"/>
+                <w:color w:val="00382E"/>
                 <w:sz w:val="19"/>
               </w:rPr>
               <w:t>PRINCIPIO BÁSICO PARA EL EMPRESARIO PYME (PARA NO ABOGADOS):</w:t>
@@ -127,7 +127,7 @@
         <w:rPr>
           <w:rFonts w:ascii="Calibri" w:hAnsi="Calibri"/>
           <w:b/>
-          <w:color w:val="0284C7"/>
+          <w:color w:val="00382E"/>
           <w:sz w:val="21"/>
         </w:rPr>
         <w:t>1. LA RUTA DE IMPLEMENTACIÓN EN 3 PASOS (15 MINUTOS)</w:t>
@@ -216,10 +216,10 @@
         <w:rPr>
           <w:rFonts w:ascii="Calibri" w:hAnsi="Calibri"/>
           <w:b/>
-          <w:color w:val="0284C7"/>
+          <w:color w:val="00382E"/>
           <w:sz w:val="17"/>
         </w:rPr>
-        <w:t>CÁLCULO LABORAL CHILE  |  PLATAFORMA LEGALTECH</w:t>
+        <w:t>CálculoLaboral.cl</w:t>
         <w:br/>
       </w:r>
       <w:r>
@@ -241,7 +241,7 @@
         <w:rPr>
           <w:rFonts w:ascii="Calibri" w:hAnsi="Calibri"/>
           <w:b/>
-          <w:color w:val="0284C7"/>
+          <w:color w:val="00382E"/>
           <w:sz w:val="21"/>
         </w:rPr>
         <w:t>2. GUÍA POR RUBROS Y SECTORES: ¿ES ESTANDARIZADO O DIFERENTE?</w:t>
@@ -279,7 +279,7 @@
         <w:tc>
           <w:tcPr>
             <w:tcW w:type="dxa" w:w="3154"/>
-            <w:shd w:fill="0F172A"/>
+            <w:shd w:fill="00382E"/>
             <w:tcMar>
               <w:top w:w="80" w:type="dxa"/>
               <w:bottom w:w="80" w:type="dxa"/>
@@ -305,7 +305,7 @@
         <w:tc>
           <w:tcPr>
             <w:tcW w:type="dxa" w:w="3154"/>
-            <w:shd w:fill="0F172A"/>
+            <w:shd w:fill="00382E"/>
             <w:tcMar>
               <w:top w:w="80" w:type="dxa"/>
               <w:bottom w:w="80" w:type="dxa"/>
@@ -331,7 +331,7 @@
         <w:tc>
           <w:tcPr>
             <w:tcW w:type="dxa" w:w="3154"/>
-            <w:shd w:fill="0F172A"/>
+            <w:shd w:fill="00382E"/>
             <w:tcMar>
               <w:top w:w="80" w:type="dxa"/>
               <w:bottom w:w="80" w:type="dxa"/>
@@ -856,10 +856,10 @@
         <w:rPr>
           <w:rFonts w:ascii="Calibri" w:hAnsi="Calibri"/>
           <w:b/>
-          <w:color w:val="0284C7"/>
+          <w:color w:val="00382E"/>
           <w:sz w:val="17"/>
         </w:rPr>
-        <w:t>CÁLCULO LABORAL CHILE  |  PLATAFORMA LEGALTECH</w:t>
+        <w:t>CálculoLaboral.cl</w:t>
         <w:br/>
       </w:r>
       <w:r>
@@ -881,7 +881,7 @@
         <w:rPr>
           <w:rFonts w:ascii="Calibri" w:hAnsi="Calibri"/>
           <w:b/>
-          <w:color w:val="0284C7"/>
+          <w:color w:val="00382E"/>
           <w:sz w:val="21"/>
         </w:rPr>
         <w:t>3. PREGUNTAS FRECUENTES (FAQ) DE DUEÑOS Y GERENTES DE PYMES</w:t>
@@ -989,7 +989,7 @@
         <w:rPr>
           <w:rFonts w:ascii="Calibri" w:hAnsi="Calibri"/>
           <w:b/>
-          <w:color w:val="0284C7"/>
+          <w:color w:val="00382E"/>
           <w:sz w:val="21"/>
         </w:rPr>
         <w:t>4. CHECKLIST DE CUMPLIMIENTO NORMATIVO (LISTA DE COTEJO)</w:t>

</xml_diff>